<commit_message>
US Digital Space SMB Sales Manager: add forecasting to every sales role, lead with Wix team lead
Co-Authored-By: Claude Opus 5.5 <noreply@anthropic.com>
Claude-Session: https://claude.ai/code/session_01XE6aV5LP3W9C1iWzBfgedS
</commit_message>
<xml_diff>
--- a/applications/us-digital-space-smb-sales-manager/USDigitalSpace-SMBSalesManager-Resume.docx
+++ b/applications/us-digital-space-smb-sales-manager/USDigitalSpace-SMBSalesManager-Resume.docx
@@ -80,7 +80,7 @@
           <w:i w:val="0"/>
           <w:color w:val="1A1A1A"/>
         </w:rPr>
-        <w:t>SMB SaaS seller and team leader with 15+ years in sales, onboarding, and account management, including back-to-back team lead roles at Wix and Fetch &amp; Funnel. At Wix, led a team of 20 (later 8) for two years, helped hire and train new team members, and built sales training for tenured account executives on a new vertical that went from proof of concept to profitable, while personally holding 120% of sales targets. Ranked top three in sales at Accelo on a team that grew from 8 to 15 reps while quota roughly doubled, so I know what separates a top rep from the middle of the board. Coaches to a repeatable process: clean pipeline, honest forecasts, and consultative selling that ties the product to the customer's revenue.</w:t>
+        <w:t>SMB SaaS seller and team leader with 15+ years in sales, onboarding, and account management, including back-to-back team lead roles at Wix and Fetch &amp; Funnel. At Wix, led a team of 20 (later 8) for two years, helped hire and train new team members, and built sales training for tenured account executives on a new vertical that went from proof of concept to profitable, while personally holding 120% of sales targets. Ranked top three in sales at Accelo on a team that grew from 8 to 15 reps while quota roughly doubled, so I know what separates a top rep from the middle of the board. Has forecast pipeline in every sales role held, and coaches to a repeatable process: clean pipeline, honest forecasts, and consultative selling that ties the product to the customer's revenue.</w:t>
       </w:r>
     </w:p>
     <w:p>
@@ -386,6 +386,30 @@
     </w:p>
     <w:p>
       <w:pPr>
+        <w:spacing w:after="30"/>
+        <w:ind w:left="259" w:hanging="259"/>
+      </w:pPr>
+      <w:r>
+        <w:rPr>
+          <w:rFonts w:ascii="Calibri" w:hAnsi="Calibri"/>
+          <w:b w:val="0"/>
+          <w:i w:val="0"/>
+          <w:color w:val="163A5F"/>
+        </w:rPr>
+        <w:t xml:space="preserve">•  </w:t>
+      </w:r>
+      <w:r>
+        <w:rPr>
+          <w:rFonts w:ascii="Calibri" w:hAnsi="Calibri"/>
+          <w:b w:val="0"/>
+          <w:i w:val="0"/>
+          <w:color w:val="1A1A1A"/>
+        </w:rPr>
+        <w:t>Forecast partner renewals and new partner deals in Salesforce, keeping stage data clean across the book.</w:t>
+      </w:r>
+    </w:p>
+    <w:p>
+      <w:pPr>
         <w:tabs>
           <w:tab w:pos="10512" w:val="right"/>
         </w:tabs>
@@ -483,6 +507,30 @@
           <w:i w:val="0"/>
           <w:color w:val="1A1A1A"/>
         </w:rPr>
+        <w:t>Owned pipeline and forecast reporting for the sales team's deals in HubSpot, flagging slipping opportunities early.</w:t>
+      </w:r>
+    </w:p>
+    <w:p>
+      <w:pPr>
+        <w:spacing w:after="30"/>
+        <w:ind w:left="259" w:hanging="259"/>
+      </w:pPr>
+      <w:r>
+        <w:rPr>
+          <w:rFonts w:ascii="Calibri" w:hAnsi="Calibri"/>
+          <w:b w:val="0"/>
+          <w:i w:val="0"/>
+          <w:color w:val="163A5F"/>
+        </w:rPr>
+        <w:t xml:space="preserve">•  </w:t>
+      </w:r>
+      <w:r>
+        <w:rPr>
+          <w:rFonts w:ascii="Calibri" w:hAnsi="Calibri"/>
+          <w:b w:val="0"/>
+          <w:i w:val="0"/>
+          <w:color w:val="1A1A1A"/>
+        </w:rPr>
         <w:t>Built internal sales and reporting processes that improved accuracy, reduced handoff errors, and strengthened alignment between sales and delivery.</w:t>
       </w:r>
     </w:p>
@@ -501,7 +549,7 @@
           <w:color w:val="1A1A1A"/>
           <w:sz w:val="21"/>
         </w:rPr>
-        <w:t>Account Manager, Onboarding Launch Specialist &amp; Team Lead</w:t>
+        <w:t>Sales &amp; Onboarding Team Lead (Account Manager, Onboarding Launch Specialist &amp; Team Lead)</w:t>
       </w:r>
       <w:r>
         <w:rPr>
@@ -562,6 +610,30 @@
           <w:color w:val="1A1A1A"/>
         </w:rPr>
         <w:t>Led and developed a team for two years (20, later 8), overseeing budgets, scope, and delivery for a high-value SMB portfolio.</w:t>
+      </w:r>
+    </w:p>
+    <w:p>
+      <w:pPr>
+        <w:spacing w:after="30"/>
+        <w:ind w:left="259" w:hanging="259"/>
+      </w:pPr>
+      <w:r>
+        <w:rPr>
+          <w:rFonts w:ascii="Calibri" w:hAnsi="Calibri"/>
+          <w:b w:val="0"/>
+          <w:i w:val="0"/>
+          <w:color w:val="163A5F"/>
+        </w:rPr>
+        <w:t xml:space="preserve">•  </w:t>
+      </w:r>
+      <w:r>
+        <w:rPr>
+          <w:rFonts w:ascii="Calibri" w:hAnsi="Calibri"/>
+          <w:b w:val="0"/>
+          <w:i w:val="0"/>
+          <w:color w:val="1A1A1A"/>
+        </w:rPr>
+        <w:t>Forecast monthly sales and launch numbers for my book and tracked the team's pipeline stages in Salesforce, keeping commits accurate against a fixed monthly target.</w:t>
       </w:r>
     </w:p>
     <w:p>
@@ -735,6 +807,30 @@
           <w:i w:val="0"/>
           <w:color w:val="1A1A1A"/>
         </w:rPr>
+        <w:t>Maintained accurate pipeline stages and monthly forecasts in the CRM, calling commits leadership could plan against while quota roughly doubled.</w:t>
+      </w:r>
+    </w:p>
+    <w:p>
+      <w:pPr>
+        <w:spacing w:after="30"/>
+        <w:ind w:left="259" w:hanging="259"/>
+      </w:pPr>
+      <w:r>
+        <w:rPr>
+          <w:rFonts w:ascii="Calibri" w:hAnsi="Calibri"/>
+          <w:b w:val="0"/>
+          <w:i w:val="0"/>
+          <w:color w:val="163A5F"/>
+        </w:rPr>
+        <w:t xml:space="preserve">•  </w:t>
+      </w:r>
+      <w:r>
+        <w:rPr>
+          <w:rFonts w:ascii="Calibri" w:hAnsi="Calibri"/>
+          <w:b w:val="0"/>
+          <w:i w:val="0"/>
+          <w:color w:val="1A1A1A"/>
+        </w:rPr>
         <w:t>Averaged ~$17,750/month in services bookings (~$213K annualized) plus new recurring revenue, selling SaaS to SMB agencies and professional-services firms.</w:t>
       </w:r>
     </w:p>
@@ -814,6 +910,30 @@
           <w:color w:val="1A1A1A"/>
         </w:rPr>
         <w:t>Ran full-cycle, high-volume SMB SaaS sales: prospecting, qualification, demos, and close.</w:t>
+      </w:r>
+    </w:p>
+    <w:p>
+      <w:pPr>
+        <w:spacing w:after="30"/>
+        <w:ind w:left="259" w:hanging="259"/>
+      </w:pPr>
+      <w:r>
+        <w:rPr>
+          <w:rFonts w:ascii="Calibri" w:hAnsi="Calibri"/>
+          <w:b w:val="0"/>
+          <w:i w:val="0"/>
+          <w:color w:val="163A5F"/>
+        </w:rPr>
+        <w:t xml:space="preserve">•  </w:t>
+      </w:r>
+      <w:r>
+        <w:rPr>
+          <w:rFonts w:ascii="Calibri" w:hAnsi="Calibri"/>
+          <w:b w:val="0"/>
+          <w:i w:val="0"/>
+          <w:color w:val="1A1A1A"/>
+        </w:rPr>
+        <w:t>Kept pipeline stages and forecasts current in Salesforce on a high-volume, monthly-quota motion.</w:t>
       </w:r>
     </w:p>
     <w:p>

</xml_diff>